<commit_message>
docs: align vendor payouts in docx legal policies with landing page to state weekly basis
</commit_message>
<xml_diff>
--- a/Final_Legal_Policies.docx
+++ b/Final_Legal_Policies.docx
@@ -3807,63 +3807,7 @@
         <w:jc w:val="both"/>
       </w:pPr>
       <w:r>
-        <w:rPr>
-          <w:b w:val="false"/>
-          <w:bCs w:val="false"/>
-          <w:i w:val="false"/>
-          <w:iCs w:val="false"/>
-          <w:sz w:val="22"/>
-          <w:szCs w:val="22"/>
-        </w:rPr>
-        <w:t xml:space="preserve">Nivara collects Session fees from Users as the Wellness Partner’s limited payment-collection agent, deducts its platform commission of </w:t>
-      </w:r>
-      <w:r>
-        <w:rPr>
-          <w:b/>
-          <w:bCs/>
-          <w:i w:val="false"/>
-          <w:iCs w:val="false"/>
-          <w:sz w:val="22"/>
-          <w:szCs w:val="22"/>
-          <w:highlight w:val="yellow"/>
-          <w:highlightCs w:val="yellow"/>
-        </w:rPr>
-        <w:t xml:space="preserve">[X%]</w:t>
-      </w:r>
-      <w:r>
-        <w:rPr>
-          <w:b w:val="false"/>
-          <w:bCs w:val="false"/>
-          <w:i w:val="false"/>
-          <w:iCs w:val="false"/>
-          <w:sz w:val="22"/>
-          <w:szCs w:val="22"/>
-        </w:rPr>
-        <w:t xml:space="preserve"> plus applicable taxes, and settles the balance to the Partner’s registered bank account within </w:t>
-      </w:r>
-      <w:r>
-        <w:rPr>
-          <w:b/>
-          <w:bCs/>
-          <w:i w:val="false"/>
-          <w:iCs w:val="false"/>
-          <w:sz w:val="22"/>
-          <w:szCs w:val="22"/>
-          <w:highlight w:val="yellow"/>
-          <w:highlightCs w:val="yellow"/>
-        </w:rPr>
-        <w:t xml:space="preserve">[T+3 business days]</w:t>
-      </w:r>
-      <w:r>
-        <w:rPr>
-          <w:b w:val="false"/>
-          <w:bCs w:val="false"/>
-          <w:i w:val="false"/>
-          <w:iCs w:val="false"/>
-          <w:sz w:val="22"/>
-          <w:szCs w:val="22"/>
-        </w:rPr>
-        <w:t xml:space="preserve">. As an e-commerce operator, Nivara will deduct/collect TDS under Section 194-O of the Income-tax Act, 1961 and TCS under Section 52 of the CGST Act, 2017, where applicable, and Partners are responsible for their own GST registration and tax compliance as required by law.</w:t>
+        <w:t>Nivara collects Session fees from Users as the Wellness Partner’s limited payment-collection agent, deducts its platform commission of [X%] plus applicable taxes, and settles the balance to the Partner’s registered bank account within weekly basis. As an e-commerce operator, Nivara will deduct/collect TDS under Section 194-O of the Income-tax Act, 1961 and TCS under Section 52 of the CGST Act, 2017, where applicable, and Partners are responsible for their own GST registration and tax compliance as required by law.</w:t>
       </w:r>
     </w:p>
     <w:p>

</xml_diff>